<commit_message>
Regenerate sample report previews from rewritten report; fix table page split
Co-Authored-By: Claude Sonnet 5.5 <noreply@anthropic.com>
Claude-Session: https://claude.ai/code/session_01VGNF22YqMhet38GotcC9rv
</commit_message>
<xml_diff>
--- a/qa/sample-report/Honour-Report-SAMPLE-rewritten.docx
+++ b/qa/sample-report/Honour-Report-SAMPLE-rewritten.docx
@@ -773,6 +773,11 @@
       <w:pPr>
         <w:spacing w:after="40"/>
       </w:pPr>
+    </w:p>
+    <w:p>
+      <w:r>
+        <w:br w:type="page"/>
+      </w:r>
     </w:p>
     <w:p>
       <w:pPr>

</xml_diff>